<commit_message>
Fill the YRD proposal body to 30 pages after adversarial review
Apply three rounds of adversarial review (NSFC standards, academic
language, expert reviewer, facts/citations), add source-backed content so
the body fills 30 pages, add a start-of-text AI-use notice, and add the
audit report and a Word pagination fallback note to the checklist.

Co-Authored-By: Claude Opus 5.5 <noreply@anthropic.com>
Claude-Session: https://claude.ai/code/session_01W8vS2pr8wPj5JjARMAH2UK
</commit_message>
<xml_diff>
--- a/2027青C申请书_长三角/2027青C_信息表格填报参考与提交前核对清单.docx
+++ b/2027青C申请书_长三角/2027青C_信息表格填报参考与提交前核对清单.docx
@@ -220,7 +220,7 @@
           <w:b w:val="0"/>
           <w:sz w:val="24"/>
         </w:rPr>
-        <w:t xml:space="preserve"> 正文原则上不超过30页。粘贴进官方模板后请导出PDF复核页数；若超出，可优先压缩（一）的研究现状综述与（二）中的方法细节。</w:t>
+        <w:t xml:space="preserve"> 正文原则上不超过30页。本稿已按30页写满（LibreOffice渲染，第30页约余1行）。Word与LibreOffice分页可能略有差异：粘贴进官方模板后请导出PDF复核；若溢出至第31页，可优先删除（四）5（4）末尾“数据管理采用可追溯流程……”一句（约3行），其次压缩（二）中的方法细节。</w:t>
       </w:r>
     </w:p>
     <w:p>
@@ -377,7 +377,7 @@
           <w:sz w:val="24"/>
           <w:highlight w:val="yellow"/>
         </w:rPr>
-        <w:t>【待申请人确认】</w:t>
+        <w:t>【待确认：申请代码选择】</w:t>
       </w:r>
       <w:r>
         <w:rPr>
@@ -417,7 +417,7 @@
           <w:sz w:val="24"/>
           <w:highlight w:val="yellow"/>
         </w:rPr>
-        <w:t>【待申请人确认】</w:t>
+        <w:t>【待确认：研究属性】</w:t>
       </w:r>
       <w:r>
         <w:rPr>
@@ -448,7 +448,7 @@
           <w:b w:val="0"/>
           <w:sz w:val="24"/>
         </w:rPr>
-        <w:t>2028年1月1日—2030年12月31日（2028-01-01—2030-12-31）</w:t>
+        <w:t>2028年1月1日—2030年12月31日</w:t>
       </w:r>
     </w:p>
     <w:p>
@@ -524,7 +524,7 @@
           <w:b w:val="0"/>
           <w:sz w:val="24"/>
         </w:rPr>
-        <w:t>极端高温威胁城市人群健康。基于自然的解决方案（NbS）日益用于城市降温，但现有评估多依据地表温度与居住地，衡量城市拥有多少自然，而非人群何时何地获得多少保护。本项目以长三角湿热河网城市群为对象，提出“实得降温保护（DCP）”，即扣除城市形态、建筑遮荫与通风影响后归因于NbS、并于人群在场时获得的降温，以避免热暴露的人·小时计量。构建2000—2024年逐时近地表气温与通用热气候指数数据集（41城1 km，杭州、上海、南京中心城区30 m），识别九类NbS逐时可归因降温、减弱与反转条件及区域差异；以三城手机信令重建人群逐时在场，聚焦老年人、低社会经济地位人群和户外工作者，在资源供给、实得保护与保护缺口三个层次检验“资源公平不等于保护公平”；以乡镇街道与区县两级分布滞后非线性模型检验DCP相对静态蓝绿空间指标的样本外解释力，估算现有NbS已避免的热相关死亡，为NbS规划与高温风险管理提供依据。</w:t>
+        <w:t>极端高温威胁城市人群健康。基于自然的解决方案（NbS）日益用于城市降温，但现有评估多依据地表温度与居住地，衡量城市拥有多少自然，而非人群何时何地获得多少保护。本项目以长三角湿热河网城市群为对象，提出“实得降温保护（DCP）”，即人群在场时因NbS可归因降温（扣除城市形态、建筑遮荫与通风影响）而避免的热暴露，以人·小时计量。构建2000—2024年逐时近地表气温与通用热气候指数数据集（41城1 km，杭州、上海、南京中心城区30 m），识别九类NbS的逐时可归因降温及其减弱、反转条件与区域差异；以三城手机信令重建人群逐时在场，聚焦老年人、低社会经济地位人群和户外工作者，在资源供给、实得保护与保护缺口三个层次检验“资源公平不等于保护公平”；以乡镇街道与区县两级分布滞后非线性模型检验DCP相对于静态蓝绿空间指标的样本外解释力，估算现有NbS已避免的热相关死亡。</w:t>
       </w:r>
     </w:p>
     <w:p>
@@ -539,7 +539,7 @@
           <w:b w:val="0"/>
           <w:sz w:val="24"/>
         </w:rPr>
-        <w:t>（中文摘要字数：400字符，含标点与空格；不计空格为398字符；上限400字符。）</w:t>
+        <w:t>（中文摘要字数：382字符，含标点与空格；上限400字符。）</w:t>
       </w:r>
     </w:p>
     <w:p>
@@ -569,7 +569,24 @@
           <w:b w:val="0"/>
           <w:sz w:val="24"/>
         </w:rPr>
-        <w:t>Extreme heat is a leading environmental health threat to urban populations. Nature-based solutions (NbS) are increasingly promoted for urban cooling, yet most assessments rely on land surface temperature and residential addresses, measuring how much nature a city holds rather than how much heat exposure it removes, when, where and for whom. Focusing on the Yangtze River Delta (YRD) urban agglomeration, a hot-humid region with dense river networks, this project proposes Delivered Cooling Protection (DCP): the cooling attributable to NbS after controlling for urban form, building shade and ventilation, received where and when people are actually present, and quantified as person-hours of avoided heat exposure. Drawing on the ecosystem services cascade, it examines morphological filtering, spatiotemporal coupling and health translation at two levels: all 41 YRD cities, and the central urban areas of Hangzhou, Shanghai and Nanjing. First, it will build and validate the YRD Heat Exposure Surface (YRD-HES), providing hourly near-surface air temperature and Universal Thermal Climate Index (UTCI) for 2000–2024 at 1 km across the 41 cities and at 30 m in the three cities, and identify the hourly attributable cooling of nine NbS types by urban form and time of day, including when cooling weakens or reverses. Estimates will be checked with difference-in-differences natural experiments and microclimate removal simulations, and compared across background climates and water-network densities. Second, using mobile phone signalling data to reconstruct hourly population presence in the three cities, it will compute DCP, per-capita DCP and DCP deficits for older adults, socioeconomically disadvantaged groups and outdoor workers, and test, across resource provision, delivered protection and protection gaps, the central hypothesis that equity in resource provision does not entail equity in delivered protection. Third, using distributed lag non-linear models of daily mortality at the township/subdistrict level in the three cities, with district/county-level models across the 41 cities as an external-validity check, it will test whether DCP as an effect modifier yields lower out-of-sample deviance than static green and blue space indicators, and estimate the heat-related deaths already averted by existing NbS, by population group. The project will reveal how NbS cooling is converted into delivered protection and health benefit, and inform NbS planning and fine-grained heat-risk management in the YRD.</w:t>
+        <w:t>Extreme heat is a leading environmental health threat to urban populations. Nature-based solutions (NbS) are increasingly promoted for urban cooling, yet most assessments rely on land surface temperature and residential addresses, measuring how much nature a city holds rather than how much heat exposure it removes, when, where and for whom. Focusing on the Yangtze River Delta (YRD) urban agglomeration, a hot-humid region with dense river networks, this project proposes Delivered Cooling Protection (DCP): the heat exposure, in person-hours, avoided where and when people are actually present owing to cooling attributable to NbS after controlling for urban form, building shade and ventilation. Drawing on the ecosystem services cascade, it examines morphological filtering, spatiotemporal coupling and health translation at two levels: all 41 YRD cities, and the central urban areas of Hangzhou, Shanghai and Nanjing. First, it will build and validate the YRD Heat Exposure Surface (YRD-HES), providing hourly near-surface air temperature and Universal Thermal Climate Index (UTCI) for 2000–2024 at 1 km across the 41 cities and at 30 m in the three cities, and identify the hourly attributable cooling of nine NbS types by urban form and time of day, including when cooling weakens or reverses. Estimates will be checked with difference-in-differences natural experiments and microclimate removal simulations, and compared across background climates and water-network densities. Second, using mobile phone signalling data to reconstruct hourly population presence in the three cities, it will compute DCP, per-capita DCP and DCP deficits for older adults, socioeconomically disadvantaged groups and outdoor workers, and test, across provision, delivered protection and protection deficit, the central hypothesis that equity in resource provision does not entail equity in delivered protection. Third, using distributed lag non-linear models of daily mortality at the township/subdistrict level in the three cities, with district/county-level models based on YRD mortality-surveillance data</w:t>
+      </w:r>
+      <w:r>
+        <w:rPr>
+          <w:rFonts w:ascii="Times New Roman" w:hAnsi="Times New Roman" w:eastAsia="宋体" w:cs="Times New Roman"/>
+          <w:b w:val="0"/>
+          <w:sz w:val="24"/>
+          <w:highlight w:val="yellow"/>
+        </w:rPr>
+        <w:t>【待补充：覆盖范围】</w:t>
+      </w:r>
+      <w:r>
+        <w:rPr>
+          <w:rFonts w:ascii="Times New Roman" w:hAnsi="Times New Roman" w:eastAsia="宋体" w:cs="Times New Roman"/>
+          <w:b w:val="0"/>
+          <w:sz w:val="24"/>
+        </w:rPr>
+        <w:t xml:space="preserve"> as an external-validity check, it will test whether DCP as an effect modifier yields lower out-of-sample deviance than static green and blue space indicators, and estimate the heat-related deaths already averted by existing NbS, by population group. The project will reveal how NbS cooling is converted into delivered protection and health benefit, and inform NbS planning and fine-grained heat-risk management in the YRD.</w:t>
       </w:r>
     </w:p>
     <w:p>
@@ -584,7 +601,7 @@
           <w:b w:val="0"/>
           <w:sz w:val="24"/>
         </w:rPr>
-        <w:t>（英文摘要字数：2523 characters，含空格，约364词；上限4000 characters。）</w:t>
+        <w:t>（英文摘要字数：2525个字符，含空格，不含占位符，约363词；上限4000个字符。）</w:t>
       </w:r>
     </w:p>
     <w:p>
@@ -645,7 +662,7 @@
           <w:sz w:val="24"/>
           <w:highlight w:val="yellow"/>
         </w:rPr>
-        <w:t>【待核实：以上海市气象部门发布为准】</w:t>
+        <w:t>【待核实：以沪杭气象部门发布为准】</w:t>
       </w:r>
     </w:p>
     <w:p>
@@ -707,7 +724,7 @@
           <w:sz w:val="24"/>
           <w:highlight w:val="yellow"/>
         </w:rPr>
-        <w:t>【待补充】</w:t>
+        <w:t>【待确认】</w:t>
       </w:r>
     </w:p>
     <w:p>
@@ -738,7 +755,7 @@
           <w:sz w:val="24"/>
           <w:highlight w:val="yellow"/>
         </w:rPr>
-        <w:t>【待确认】</w:t>
+        <w:t>【待补充】</w:t>
       </w:r>
     </w:p>
     <w:p>
@@ -831,7 +848,7 @@
           <w:sz w:val="24"/>
           <w:highlight w:val="yellow"/>
         </w:rPr>
-        <w:t>【待补充：范围与单元数】</w:t>
+        <w:t>【待补充：范围、单元数与暖季日均死亡数】</w:t>
       </w:r>
     </w:p>
     <w:p>
@@ -862,7 +879,7 @@
           <w:sz w:val="24"/>
           <w:highlight w:val="yellow"/>
         </w:rPr>
-        <w:t>【待补充：来源、年份与编码】</w:t>
+        <w:t>【待补充：人数】</w:t>
       </w:r>
     </w:p>
     <w:p>
@@ -893,7 +910,7 @@
           <w:sz w:val="24"/>
           <w:highlight w:val="yellow"/>
         </w:rPr>
-        <w:t>【待核实：聘任岗位、期限与每年工作时间】</w:t>
+        <w:t>【待核实：与依托单位的聘任关系，见（四）5（1）】</w:t>
       </w:r>
     </w:p>
     <w:p>
@@ -955,7 +972,7 @@
           <w:sz w:val="24"/>
           <w:highlight w:val="yellow"/>
         </w:rPr>
-        <w:t>【待核实：研究城市与年份】</w:t>
+        <w:t>【待核实：研究区（是否浙江）与年份】</w:t>
       </w:r>
     </w:p>
     <w:p>
@@ -1017,7 +1034,7 @@
           <w:sz w:val="24"/>
           <w:highlight w:val="yellow"/>
         </w:rPr>
-        <w:t>【待核实：统计来源】</w:t>
+        <w:t>【待核实：提交前更新并注明数据库】</w:t>
       </w:r>
     </w:p>
     <w:p>
@@ -1079,7 +1096,7 @@
           <w:sz w:val="24"/>
           <w:highlight w:val="yellow"/>
         </w:rPr>
-        <w:t>【待补充：年份、粒度、范围与授权方式】</w:t>
+        <w:t>【待补充：信令年份与时空粒度；死亡数据年份、死因编码、乡镇街道数与暖季日均死亡数】</w:t>
       </w:r>
     </w:p>
     <w:p>
@@ -1358,7 +1375,7 @@
           <w:sz w:val="24"/>
           <w:highlight w:val="yellow"/>
         </w:rPr>
-        <w:t>【待核实：是否为正式登记成员】</w:t>
+        <w:t>【待核实：是否为正式成员，否则本项写“无”】</w:t>
       </w:r>
     </w:p>
     <w:p>
@@ -1451,7 +1468,7 @@
           <w:sz w:val="24"/>
           <w:highlight w:val="yellow"/>
         </w:rPr>
-        <w:t>【待核实：提交时是否仍在执行期】</w:t>
+        <w:t>【待核实：提交时是否在研】</w:t>
       </w:r>
     </w:p>
     <w:p>
@@ -1513,7 +1530,7 @@
           <w:sz w:val="24"/>
           <w:highlight w:val="yellow"/>
         </w:rPr>
-        <w:t>【待核实：是否使用其数据及授权范围】</w:t>
+        <w:t>【待核实：是否使用其数据】</w:t>
       </w:r>
     </w:p>
     <w:p>
@@ -1575,7 +1592,7 @@
           <w:sz w:val="24"/>
           <w:highlight w:val="yellow"/>
         </w:rPr>
-        <w:t>【待核实：在依托单位的聘用关系、聘任岗位、期限与每年工作时间】</w:t>
+        <w:t>【待核实：全职或非全职，须与个人简历一致】</w:t>
       </w:r>
     </w:p>
     <w:p>
@@ -1606,7 +1623,7 @@
           <w:sz w:val="24"/>
           <w:highlight w:val="yellow"/>
         </w:rPr>
-        <w:t>【待补充：提名结果及是否已正式申请】</w:t>
+        <w:t>【待补充】</w:t>
       </w:r>
     </w:p>
     <w:p>
@@ -1637,7 +1654,69 @@
           <w:sz w:val="24"/>
           <w:highlight w:val="yellow"/>
         </w:rPr>
-        <w:t>【待申请人确认】</w:t>
+        <w:t>【待补充：未获提名、评审中或已获资助】</w:t>
+      </w:r>
+    </w:p>
+    <w:p>
+      <w:pPr>
+        <w:spacing w:lineRule="exact" w:line="400" w:before="0" w:after="0"/>
+        <w:ind w:left="720" w:hanging="238"/>
+        <w:jc w:val="both"/>
+      </w:pPr>
+      <w:r>
+        <w:rPr>
+          <w:rFonts w:ascii="Times New Roman" w:hAnsi="Times New Roman" w:eastAsia="宋体" w:cs="Times New Roman"/>
+          <w:sz w:val="24"/>
+        </w:rPr>
+        <w:t xml:space="preserve">• </w:t>
+      </w:r>
+      <w:r>
+        <w:rPr>
+          <w:rFonts w:ascii="Times New Roman" w:hAnsi="Times New Roman" w:eastAsia="宋体" w:cs="Times New Roman"/>
+          <w:b w:val="0"/>
+          <w:sz w:val="24"/>
+        </w:rPr>
+        <w:t>（四）5 其他：</w:t>
+      </w:r>
+      <w:r>
+        <w:rPr>
+          <w:rFonts w:ascii="Times New Roman" w:hAnsi="Times New Roman" w:eastAsia="宋体" w:cs="Times New Roman"/>
+          <w:b w:val="0"/>
+          <w:sz w:val="24"/>
+          <w:highlight w:val="yellow"/>
+        </w:rPr>
+        <w:t>【待确认】</w:t>
+      </w:r>
+    </w:p>
+    <w:p>
+      <w:pPr>
+        <w:spacing w:lineRule="exact" w:line="400" w:before="0" w:after="0"/>
+        <w:ind w:left="720" w:hanging="238"/>
+        <w:jc w:val="both"/>
+      </w:pPr>
+      <w:r>
+        <w:rPr>
+          <w:rFonts w:ascii="Times New Roman" w:hAnsi="Times New Roman" w:eastAsia="宋体" w:cs="Times New Roman"/>
+          <w:sz w:val="24"/>
+        </w:rPr>
+        <w:t xml:space="preserve">• </w:t>
+      </w:r>
+      <w:r>
+        <w:rPr>
+          <w:rFonts w:ascii="Times New Roman" w:hAnsi="Times New Roman" w:eastAsia="宋体" w:cs="Times New Roman"/>
+          <w:b w:val="0"/>
+          <w:sz w:val="24"/>
+        </w:rPr>
+        <w:t>（四）5 其他：</w:t>
+      </w:r>
+      <w:r>
+        <w:rPr>
+          <w:rFonts w:ascii="Times New Roman" w:hAnsi="Times New Roman" w:eastAsia="宋体" w:cs="Times New Roman"/>
+          <w:b w:val="0"/>
+          <w:sz w:val="24"/>
+          <w:highlight w:val="yellow"/>
+        </w:rPr>
+        <w:t>【待确认：列出采用部分】</w:t>
       </w:r>
     </w:p>
     <w:p>

</xml_diff>

<commit_message>
Fix page-count mismatch and fill the body to 30 Word pages
LibreOffice snapped exact-spaced lines to the template's line grid, so the
earlier 30-page render was really 21 pages in Word. Disable grid snapping,
calibrate a Word-like page estimate, use the template's 22 pt body spacing,
expand the content substantively, run two more adversarial review rounds
plus a targeted final check, and update the audit report and checklist.
The LibreOffice preview PDF is removed because its pagination differs from
Word.

Co-Authored-By: Claude Opus 5.5 <noreply@anthropic.com>
Claude-Session: https://claude.ai/code/session_01W8vS2pr8wPj5JjARMAH2UK
</commit_message>
<xml_diff>
--- a/2027青C申请书_长三角/2027青C_信息表格填报参考与提交前核对清单.docx
+++ b/2027青C申请书_长三角/2027青C_信息表格填报参考与提交前核对清单.docx
@@ -4,6 +4,7 @@
   <w:body>
     <w:p>
       <w:pPr>
+        <w:snapToGrid w:val="0"/>
         <w:spacing w:lineRule="exact" w:line="704" w:before="0" w:after="120"/>
         <w:jc w:val="center"/>
       </w:pPr>
@@ -18,6 +19,7 @@
     </w:p>
     <w:p>
       <w:pPr>
+        <w:snapToGrid w:val="0"/>
         <w:spacing w:lineRule="exact" w:line="448" w:before="120" w:after="120"/>
         <w:jc w:val="center"/>
       </w:pPr>
@@ -33,6 +35,7 @@
     <w:p>
       <w:pPr>
         <w:keepNext/>
+        <w:snapToGrid w:val="0"/>
         <w:spacing w:lineRule="exact" w:line="440" w:before="160" w:after="40"/>
         <w:jc w:val="both"/>
       </w:pPr>
@@ -47,7 +50,8 @@
     </w:p>
     <w:p>
       <w:pPr>
-        <w:spacing w:lineRule="exact" w:line="400" w:before="0" w:after="0"/>
+        <w:snapToGrid w:val="0"/>
+        <w:spacing w:lineRule="exact" w:line="440" w:before="0" w:after="0"/>
         <w:ind w:firstLineChars="200" w:firstLine="480"/>
         <w:jc w:val="both"/>
       </w:pPr>
@@ -70,7 +74,8 @@
     </w:p>
     <w:p>
       <w:pPr>
-        <w:spacing w:lineRule="exact" w:line="400" w:before="0" w:after="0"/>
+        <w:snapToGrid w:val="0"/>
+        <w:spacing w:lineRule="exact" w:line="440" w:before="0" w:after="0"/>
         <w:ind w:firstLineChars="200" w:firstLine="480"/>
         <w:jc w:val="both"/>
       </w:pPr>
@@ -93,7 +98,8 @@
     </w:p>
     <w:p>
       <w:pPr>
-        <w:spacing w:lineRule="exact" w:line="400" w:before="0" w:after="0"/>
+        <w:snapToGrid w:val="0"/>
+        <w:spacing w:lineRule="exact" w:line="440" w:before="0" w:after="0"/>
         <w:ind w:firstLineChars="200" w:firstLine="480"/>
         <w:jc w:val="both"/>
       </w:pPr>
@@ -133,7 +139,8 @@
     </w:p>
     <w:p>
       <w:pPr>
-        <w:spacing w:lineRule="exact" w:line="400" w:before="0" w:after="0"/>
+        <w:snapToGrid w:val="0"/>
+        <w:spacing w:lineRule="exact" w:line="440" w:before="0" w:after="0"/>
         <w:ind w:firstLineChars="200" w:firstLine="480"/>
         <w:jc w:val="both"/>
       </w:pPr>
@@ -156,7 +163,8 @@
     </w:p>
     <w:p>
       <w:pPr>
-        <w:spacing w:lineRule="exact" w:line="400" w:before="0" w:after="0"/>
+        <w:snapToGrid w:val="0"/>
+        <w:spacing w:lineRule="exact" w:line="440" w:before="0" w:after="0"/>
         <w:ind w:firstLineChars="200" w:firstLine="480"/>
         <w:jc w:val="both"/>
       </w:pPr>
@@ -179,7 +187,8 @@
     </w:p>
     <w:p>
       <w:pPr>
-        <w:spacing w:lineRule="exact" w:line="400" w:before="0" w:after="0"/>
+        <w:snapToGrid w:val="0"/>
+        <w:spacing w:lineRule="exact" w:line="440" w:before="0" w:after="0"/>
         <w:ind w:firstLineChars="200" w:firstLine="480"/>
         <w:jc w:val="both"/>
       </w:pPr>
@@ -202,7 +211,8 @@
     </w:p>
     <w:p>
       <w:pPr>
-        <w:spacing w:lineRule="exact" w:line="400" w:before="0" w:after="0"/>
+        <w:snapToGrid w:val="0"/>
+        <w:spacing w:lineRule="exact" w:line="440" w:before="0" w:after="0"/>
         <w:ind w:firstLineChars="200" w:firstLine="480"/>
         <w:jc w:val="both"/>
       </w:pPr>
@@ -212,7 +222,7 @@
           <w:b/>
           <w:sz w:val="24"/>
         </w:rPr>
-        <w:t>7. 篇幅。</w:t>
+        <w:t>7. 篇幅与分页。</w:t>
       </w:r>
       <w:r>
         <w:rPr>
@@ -220,12 +230,13 @@
           <w:b w:val="0"/>
           <w:sz w:val="24"/>
         </w:rPr>
-        <w:t xml:space="preserve"> 正文原则上不超过30页。本稿已按30页写满（LibreOffice渲染，第30页约余1行）。Word与LibreOffice分页可能略有差异：粘贴进官方模板后请导出PDF复核；若溢出至第31页，可优先删除（四）5（4）末尾“数据管理采用可追溯流程……”一句（约3行），其次压缩（二）中的方法细节。</w:t>
+        <w:t xml:space="preserve"> 正文按Word分页写满30页：采用模板默认的宋体小四、固定值22磅行距，经与Word实测页数校准的版式估算，第30页约八成满。WPS或LibreOffice的分页可能比Word多出约1/3页，请以Word打开复核。若Word中超过30页，可先删去（四）5（4）末尾“数据管理采用可追溯流程……”一句（约3行）；若明显不足30页，可将图1、图2宽度由14.6 cm调至15.5 cm。</w:t>
       </w:r>
     </w:p>
     <w:p>
       <w:pPr>
         <w:keepNext/>
+        <w:snapToGrid w:val="0"/>
         <w:spacing w:lineRule="exact" w:line="440" w:before="160" w:after="40"/>
         <w:jc w:val="both"/>
       </w:pPr>
@@ -240,7 +251,8 @@
     </w:p>
     <w:p>
       <w:pPr>
-        <w:spacing w:lineRule="exact" w:line="400" w:before="0" w:after="0"/>
+        <w:snapToGrid w:val="0"/>
+        <w:spacing w:lineRule="exact" w:line="440" w:before="0" w:after="0"/>
         <w:ind w:firstLineChars="200" w:firstLine="480"/>
         <w:jc w:val="both"/>
       </w:pPr>
@@ -263,7 +275,8 @@
     </w:p>
     <w:p>
       <w:pPr>
-        <w:spacing w:lineRule="exact" w:line="400" w:before="0" w:after="0"/>
+        <w:snapToGrid w:val="0"/>
+        <w:spacing w:lineRule="exact" w:line="440" w:before="0" w:after="0"/>
         <w:ind w:firstLineChars="200" w:firstLine="480"/>
         <w:jc w:val="both"/>
       </w:pPr>
@@ -286,7 +299,8 @@
     </w:p>
     <w:p>
       <w:pPr>
-        <w:spacing w:lineRule="exact" w:line="400" w:before="0" w:after="0"/>
+        <w:snapToGrid w:val="0"/>
+        <w:spacing w:lineRule="exact" w:line="440" w:before="0" w:after="0"/>
         <w:ind w:firstLineChars="200" w:firstLine="480"/>
         <w:jc w:val="both"/>
       </w:pPr>
@@ -318,7 +332,8 @@
     </w:p>
     <w:p>
       <w:pPr>
-        <w:spacing w:lineRule="exact" w:line="400" w:before="0" w:after="0"/>
+        <w:snapToGrid w:val="0"/>
+        <w:spacing w:lineRule="exact" w:line="440" w:before="0" w:after="0"/>
         <w:ind w:firstLineChars="200" w:firstLine="480"/>
         <w:jc w:val="both"/>
       </w:pPr>
@@ -350,7 +365,8 @@
     </w:p>
     <w:p>
       <w:pPr>
-        <w:spacing w:lineRule="exact" w:line="400" w:before="0" w:after="0"/>
+        <w:snapToGrid w:val="0"/>
+        <w:spacing w:lineRule="exact" w:line="440" w:before="0" w:after="0"/>
         <w:ind w:firstLineChars="200" w:firstLine="480"/>
         <w:jc w:val="both"/>
       </w:pPr>
@@ -390,7 +406,8 @@
     </w:p>
     <w:p>
       <w:pPr>
-        <w:spacing w:lineRule="exact" w:line="400" w:before="0" w:after="0"/>
+        <w:snapToGrid w:val="0"/>
+        <w:spacing w:lineRule="exact" w:line="440" w:before="0" w:after="0"/>
         <w:ind w:firstLineChars="200" w:firstLine="480"/>
         <w:jc w:val="both"/>
       </w:pPr>
@@ -430,7 +447,8 @@
     </w:p>
     <w:p>
       <w:pPr>
-        <w:spacing w:lineRule="exact" w:line="400" w:before="0" w:after="0"/>
+        <w:snapToGrid w:val="0"/>
+        <w:spacing w:lineRule="exact" w:line="440" w:before="0" w:after="0"/>
         <w:ind w:firstLineChars="200" w:firstLine="480"/>
         <w:jc w:val="both"/>
       </w:pPr>
@@ -453,7 +471,8 @@
     </w:p>
     <w:p>
       <w:pPr>
-        <w:spacing w:lineRule="exact" w:line="400" w:before="0" w:after="0"/>
+        <w:snapToGrid w:val="0"/>
+        <w:spacing w:lineRule="exact" w:line="440" w:before="0" w:after="0"/>
         <w:ind w:firstLineChars="200" w:firstLine="480"/>
         <w:jc w:val="both"/>
       </w:pPr>
@@ -476,7 +495,8 @@
     </w:p>
     <w:p>
       <w:pPr>
-        <w:spacing w:lineRule="exact" w:line="400" w:before="0" w:after="0"/>
+        <w:snapToGrid w:val="0"/>
+        <w:spacing w:lineRule="exact" w:line="440" w:before="0" w:after="0"/>
         <w:ind w:firstLineChars="200" w:firstLine="480"/>
         <w:jc w:val="both"/>
       </w:pPr>
@@ -499,7 +519,8 @@
     </w:p>
     <w:p>
       <w:pPr>
-        <w:spacing w:lineRule="exact" w:line="400" w:before="0" w:after="0"/>
+        <w:snapToGrid w:val="0"/>
+        <w:spacing w:lineRule="exact" w:line="440" w:before="0" w:after="0"/>
         <w:ind w:firstLineChars="200" w:firstLine="480"/>
         <w:jc w:val="both"/>
       </w:pPr>
@@ -514,7 +535,8 @@
     </w:p>
     <w:p>
       <w:pPr>
-        <w:spacing w:lineRule="exact" w:line="400" w:before="0" w:after="0"/>
+        <w:snapToGrid w:val="0"/>
+        <w:spacing w:lineRule="exact" w:line="440" w:before="0" w:after="0"/>
         <w:ind w:firstLineChars="200" w:firstLine="480"/>
         <w:jc w:val="both"/>
       </w:pPr>
@@ -529,7 +551,8 @@
     </w:p>
     <w:p>
       <w:pPr>
-        <w:spacing w:lineRule="exact" w:line="400" w:before="0" w:after="0"/>
+        <w:snapToGrid w:val="0"/>
+        <w:spacing w:lineRule="exact" w:line="440" w:before="0" w:after="0"/>
         <w:ind w:firstLineChars="200" w:firstLine="480"/>
         <w:jc w:val="both"/>
       </w:pPr>
@@ -544,7 +567,8 @@
     </w:p>
     <w:p>
       <w:pPr>
-        <w:spacing w:lineRule="exact" w:line="400" w:before="0" w:after="0"/>
+        <w:snapToGrid w:val="0"/>
+        <w:spacing w:lineRule="exact" w:line="440" w:before="0" w:after="0"/>
         <w:ind w:firstLineChars="200" w:firstLine="480"/>
         <w:jc w:val="both"/>
       </w:pPr>
@@ -559,7 +583,8 @@
     </w:p>
     <w:p>
       <w:pPr>
-        <w:spacing w:lineRule="exact" w:line="400" w:before="0" w:after="0"/>
+        <w:snapToGrid w:val="0"/>
+        <w:spacing w:lineRule="exact" w:line="440" w:before="0" w:after="0"/>
         <w:ind w:firstLineChars="200" w:firstLine="480"/>
         <w:jc w:val="both"/>
       </w:pPr>
@@ -591,7 +616,8 @@
     </w:p>
     <w:p>
       <w:pPr>
-        <w:spacing w:lineRule="exact" w:line="400" w:before="0" w:after="0"/>
+        <w:snapToGrid w:val="0"/>
+        <w:spacing w:lineRule="exact" w:line="440" w:before="0" w:after="0"/>
         <w:ind w:firstLineChars="200" w:firstLine="480"/>
         <w:jc w:val="both"/>
       </w:pPr>
@@ -601,12 +627,13 @@
           <w:b w:val="0"/>
           <w:sz w:val="24"/>
         </w:rPr>
-        <w:t>（英文摘要字数：2525个字符，含空格，不含占位符，约363词；上限4000个字符。）</w:t>
+        <w:t>（英文摘要字数：2519个字符，含空格，不含占位符，约362词；上限4000个字符。）</w:t>
       </w:r>
     </w:p>
     <w:p>
       <w:pPr>
         <w:keepNext/>
+        <w:snapToGrid w:val="0"/>
         <w:spacing w:lineRule="exact" w:line="440" w:before="160" w:after="40"/>
         <w:jc w:val="both"/>
       </w:pPr>
@@ -621,7 +648,8 @@
     </w:p>
     <w:p>
       <w:pPr>
-        <w:spacing w:lineRule="exact" w:line="400" w:before="0" w:after="0"/>
+        <w:snapToGrid w:val="0"/>
+        <w:spacing w:lineRule="exact" w:line="440" w:before="0" w:after="0"/>
         <w:ind w:firstLineChars="200" w:firstLine="480"/>
         <w:jc w:val="both"/>
       </w:pPr>
@@ -636,7 +664,8 @@
     </w:p>
     <w:p>
       <w:pPr>
-        <w:spacing w:lineRule="exact" w:line="400" w:before="0" w:after="0"/>
+        <w:snapToGrid w:val="0"/>
+        <w:spacing w:lineRule="exact" w:line="440" w:before="0" w:after="0"/>
         <w:ind w:left="720" w:hanging="238"/>
         <w:jc w:val="both"/>
       </w:pPr>
@@ -667,7 +696,8 @@
     </w:p>
     <w:p>
       <w:pPr>
-        <w:spacing w:lineRule="exact" w:line="400" w:before="0" w:after="0"/>
+        <w:snapToGrid w:val="0"/>
+        <w:spacing w:lineRule="exact" w:line="440" w:before="0" w:after="0"/>
         <w:ind w:left="720" w:hanging="238"/>
         <w:jc w:val="both"/>
       </w:pPr>
@@ -698,7 +728,8 @@
     </w:p>
     <w:p>
       <w:pPr>
-        <w:spacing w:lineRule="exact" w:line="400" w:before="0" w:after="0"/>
+        <w:snapToGrid w:val="0"/>
+        <w:spacing w:lineRule="exact" w:line="440" w:before="0" w:after="0"/>
         <w:ind w:left="720" w:hanging="238"/>
         <w:jc w:val="both"/>
       </w:pPr>
@@ -729,7 +760,8 @@
     </w:p>
     <w:p>
       <w:pPr>
-        <w:spacing w:lineRule="exact" w:line="400" w:before="0" w:after="0"/>
+        <w:snapToGrid w:val="0"/>
+        <w:spacing w:lineRule="exact" w:line="440" w:before="0" w:after="0"/>
         <w:ind w:left="720" w:hanging="238"/>
         <w:jc w:val="both"/>
       </w:pPr>
@@ -760,7 +792,8 @@
     </w:p>
     <w:p>
       <w:pPr>
-        <w:spacing w:lineRule="exact" w:line="400" w:before="0" w:after="0"/>
+        <w:snapToGrid w:val="0"/>
+        <w:spacing w:lineRule="exact" w:line="440" w:before="0" w:after="0"/>
         <w:ind w:left="720" w:hanging="238"/>
         <w:jc w:val="both"/>
       </w:pPr>
@@ -791,7 +824,8 @@
     </w:p>
     <w:p>
       <w:pPr>
-        <w:spacing w:lineRule="exact" w:line="400" w:before="0" w:after="0"/>
+        <w:snapToGrid w:val="0"/>
+        <w:spacing w:lineRule="exact" w:line="440" w:before="0" w:after="0"/>
         <w:ind w:left="720" w:hanging="238"/>
         <w:jc w:val="both"/>
       </w:pPr>
@@ -822,7 +856,40 @@
     </w:p>
     <w:p>
       <w:pPr>
-        <w:spacing w:lineRule="exact" w:line="400" w:before="0" w:after="0"/>
+        <w:snapToGrid w:val="0"/>
+        <w:spacing w:lineRule="exact" w:line="440" w:before="0" w:after="0"/>
+        <w:ind w:left="720" w:hanging="238"/>
+        <w:jc w:val="both"/>
+      </w:pPr>
+      <w:r>
+        <w:rPr>
+          <w:rFonts w:ascii="Times New Roman" w:hAnsi="Times New Roman" w:eastAsia="宋体" w:cs="Times New Roman"/>
+          <w:sz w:val="24"/>
+        </w:rPr>
+        <w:t xml:space="preserve">• </w:t>
+      </w:r>
+      <w:r>
+        <w:rPr>
+          <w:rFonts w:ascii="Times New Roman" w:hAnsi="Times New Roman" w:eastAsia="宋体" w:cs="Times New Roman"/>
+          <w:b w:val="0"/>
+          <w:sz w:val="24"/>
+        </w:rPr>
+        <w:t>（二）研究内容：</w:t>
+      </w:r>
+      <w:r>
+        <w:rPr>
+          <w:rFonts w:ascii="Times New Roman" w:hAnsi="Times New Roman" w:eastAsia="宋体" w:cs="Times New Roman"/>
+          <w:b w:val="0"/>
+          <w:sz w:val="24"/>
+          <w:highlight w:val="yellow"/>
+        </w:rPr>
+        <w:t>【待确认：如为运营商汇总产品则核对其口径】</w:t>
+      </w:r>
+    </w:p>
+    <w:p>
+      <w:pPr>
+        <w:snapToGrid w:val="0"/>
+        <w:spacing w:lineRule="exact" w:line="440" w:before="0" w:after="0"/>
         <w:ind w:left="720" w:hanging="238"/>
         <w:jc w:val="both"/>
       </w:pPr>
@@ -853,7 +920,72 @@
     </w:p>
     <w:p>
       <w:pPr>
-        <w:spacing w:lineRule="exact" w:line="400" w:before="0" w:after="0"/>
+        <w:snapToGrid w:val="0"/>
+        <w:spacing w:lineRule="exact" w:line="440" w:before="0" w:after="0"/>
+        <w:ind w:left="720" w:hanging="238"/>
+        <w:jc w:val="both"/>
+      </w:pPr>
+      <w:r>
+        <w:rPr>
+          <w:rFonts w:ascii="Times New Roman" w:hAnsi="Times New Roman" w:eastAsia="宋体" w:cs="Times New Roman"/>
+          <w:sz w:val="24"/>
+        </w:rPr>
+        <w:t xml:space="preserve">• </w:t>
+      </w:r>
+      <w:r>
+        <w:rPr>
+          <w:rFonts w:ascii="Times New Roman" w:hAnsi="Times New Roman" w:eastAsia="宋体" w:cs="Times New Roman"/>
+          <w:b w:val="0"/>
+          <w:sz w:val="24"/>
+        </w:rPr>
+        <w:t>（二）研究内容：</w:t>
+      </w:r>
+      <w:r>
+        <w:rPr>
+          <w:rFonts w:ascii="Times New Roman" w:hAnsi="Times New Roman" w:eastAsia="宋体" w:cs="Times New Roman"/>
+          <w:b w:val="0"/>
+          <w:sz w:val="24"/>
+          <w:highlight w:val="yellow"/>
+        </w:rPr>
+        <w:t>【待补充：合作者、单位与分工；如无则删去本句】</w:t>
+      </w:r>
+    </w:p>
+    <w:p>
+      <w:pPr>
+        <w:snapToGrid w:val="0"/>
+        <w:spacing w:lineRule="exact" w:line="440" w:before="0" w:after="0"/>
+        <w:ind w:left="720" w:hanging="238"/>
+        <w:jc w:val="both"/>
+      </w:pPr>
+      <w:r>
+        <w:rPr>
+          <w:rFonts w:ascii="Times New Roman" w:hAnsi="Times New Roman" w:eastAsia="宋体" w:cs="Times New Roman"/>
+          <w:sz w:val="24"/>
+        </w:rPr>
+        <w:t xml:space="preserve">• </w:t>
+      </w:r>
+      <w:r>
+        <w:rPr>
+          <w:rFonts w:ascii="Times New Roman" w:hAnsi="Times New Roman" w:eastAsia="宋体" w:cs="Times New Roman"/>
+          <w:b w:val="0"/>
+          <w:sz w:val="24"/>
+        </w:rPr>
+        <w:t>（二）研究内容：</w:t>
+      </w:r>
+      <w:r>
+        <w:rPr>
+          <w:rFonts w:ascii="Times New Roman" w:hAnsi="Times New Roman" w:eastAsia="宋体" w:cs="Times New Roman"/>
+          <w:b w:val="0"/>
+          <w:sz w:val="24"/>
+          <w:highlight w:val="yellow"/>
+        </w:rPr>
+        <w:t>【待补充：会议名称】</w:t>
+      </w:r>
+    </w:p>
+    <w:p>
+      <w:pPr>
+        <w:snapToGrid w:val="0"/>
+        <w:spacing w:lineRule="exact" w:line="440" w:before="0" w:after="0"/>
         <w:ind w:left="720" w:hanging="238"/>
         <w:jc w:val="both"/>
       </w:pPr>
@@ -884,7 +1016,8 @@
     </w:p>
     <w:p>
       <w:pPr>
-        <w:spacing w:lineRule="exact" w:line="400" w:before="0" w:after="0"/>
+        <w:snapToGrid w:val="0"/>
+        <w:spacing w:lineRule="exact" w:line="440" w:before="0" w:after="0"/>
         <w:ind w:left="720" w:hanging="238"/>
         <w:jc w:val="both"/>
       </w:pPr>
@@ -915,7 +1048,8 @@
     </w:p>
     <w:p>
       <w:pPr>
-        <w:spacing w:lineRule="exact" w:line="400" w:before="0" w:after="0"/>
+        <w:snapToGrid w:val="0"/>
+        <w:spacing w:lineRule="exact" w:line="440" w:before="0" w:after="0"/>
         <w:ind w:left="720" w:hanging="238"/>
         <w:jc w:val="both"/>
       </w:pPr>
@@ -946,7 +1080,8 @@
     </w:p>
     <w:p>
       <w:pPr>
-        <w:spacing w:lineRule="exact" w:line="400" w:before="0" w:after="0"/>
+        <w:snapToGrid w:val="0"/>
+        <w:spacing w:lineRule="exact" w:line="440" w:before="0" w:after="0"/>
         <w:ind w:left="720" w:hanging="238"/>
         <w:jc w:val="both"/>
       </w:pPr>
@@ -977,7 +1112,8 @@
     </w:p>
     <w:p>
       <w:pPr>
-        <w:spacing w:lineRule="exact" w:line="400" w:before="0" w:after="0"/>
+        <w:snapToGrid w:val="0"/>
+        <w:spacing w:lineRule="exact" w:line="440" w:before="0" w:after="0"/>
         <w:ind w:left="720" w:hanging="238"/>
         <w:jc w:val="both"/>
       </w:pPr>
@@ -1008,7 +1144,8 @@
     </w:p>
     <w:p>
       <w:pPr>
-        <w:spacing w:lineRule="exact" w:line="400" w:before="0" w:after="0"/>
+        <w:snapToGrid w:val="0"/>
+        <w:spacing w:lineRule="exact" w:line="440" w:before="0" w:after="0"/>
         <w:ind w:left="720" w:hanging="238"/>
         <w:jc w:val="both"/>
       </w:pPr>
@@ -1039,7 +1176,8 @@
     </w:p>
     <w:p>
       <w:pPr>
-        <w:spacing w:lineRule="exact" w:line="400" w:before="0" w:after="0"/>
+        <w:snapToGrid w:val="0"/>
+        <w:spacing w:lineRule="exact" w:line="440" w:before="0" w:after="0"/>
         <w:ind w:left="720" w:hanging="238"/>
         <w:jc w:val="both"/>
       </w:pPr>
@@ -1070,7 +1208,40 @@
     </w:p>
     <w:p>
       <w:pPr>
-        <w:spacing w:lineRule="exact" w:line="400" w:before="0" w:after="0"/>
+        <w:snapToGrid w:val="0"/>
+        <w:spacing w:lineRule="exact" w:line="440" w:before="0" w:after="0"/>
+        <w:ind w:left="720" w:hanging="238"/>
+        <w:jc w:val="both"/>
+      </w:pPr>
+      <w:r>
+        <w:rPr>
+          <w:rFonts w:ascii="Times New Roman" w:hAnsi="Times New Roman" w:eastAsia="宋体" w:cs="Times New Roman"/>
+          <w:sz w:val="24"/>
+        </w:rPr>
+        <w:t xml:space="preserve">• </w:t>
+      </w:r>
+      <w:r>
+        <w:rPr>
+          <w:rFonts w:ascii="Times New Roman" w:hAnsi="Times New Roman" w:eastAsia="宋体" w:cs="Times New Roman"/>
+          <w:b w:val="0"/>
+          <w:sz w:val="24"/>
+        </w:rPr>
+        <w:t>（三）1 研究基础与可行性分析：</w:t>
+      </w:r>
+      <w:r>
+        <w:rPr>
+          <w:rFonts w:ascii="Times New Roman" w:hAnsi="Times New Roman" w:eastAsia="宋体" w:cs="Times New Roman"/>
+          <w:b w:val="0"/>
+          <w:sz w:val="24"/>
+          <w:highlight w:val="yellow"/>
+        </w:rPr>
+        <w:t>【待核实：会议正式名称】</w:t>
+      </w:r>
+    </w:p>
+    <w:p>
+      <w:pPr>
+        <w:snapToGrid w:val="0"/>
+        <w:spacing w:lineRule="exact" w:line="440" w:before="0" w:after="0"/>
         <w:ind w:left="720" w:hanging="238"/>
         <w:jc w:val="both"/>
       </w:pPr>
@@ -1101,7 +1272,8 @@
     </w:p>
     <w:p>
       <w:pPr>
-        <w:spacing w:lineRule="exact" w:line="400" w:before="0" w:after="0"/>
+        <w:snapToGrid w:val="0"/>
+        <w:spacing w:lineRule="exact" w:line="440" w:before="0" w:after="0"/>
         <w:ind w:left="720" w:hanging="238"/>
         <w:jc w:val="both"/>
       </w:pPr>
@@ -1127,12 +1299,45 @@
           <w:sz w:val="24"/>
           <w:highlight w:val="yellow"/>
         </w:rPr>
-        <w:t>【待补充：流行病学合作者（如有）及分工】</w:t>
+        <w:t>【待核实：参与身份】</w:t>
       </w:r>
     </w:p>
     <w:p>
       <w:pPr>
-        <w:spacing w:lineRule="exact" w:line="400" w:before="0" w:after="0"/>
+        <w:snapToGrid w:val="0"/>
+        <w:spacing w:lineRule="exact" w:line="440" w:before="0" w:after="0"/>
+        <w:ind w:left="720" w:hanging="238"/>
+        <w:jc w:val="both"/>
+      </w:pPr>
+      <w:r>
+        <w:rPr>
+          <w:rFonts w:ascii="Times New Roman" w:hAnsi="Times New Roman" w:eastAsia="宋体" w:cs="Times New Roman"/>
+          <w:sz w:val="24"/>
+        </w:rPr>
+        <w:t xml:space="preserve">• </w:t>
+      </w:r>
+      <w:r>
+        <w:rPr>
+          <w:rFonts w:ascii="Times New Roman" w:hAnsi="Times New Roman" w:eastAsia="宋体" w:cs="Times New Roman"/>
+          <w:b w:val="0"/>
+          <w:sz w:val="24"/>
+        </w:rPr>
+        <w:t>（三）1 研究基础与可行性分析：</w:t>
+      </w:r>
+      <w:r>
+        <w:rPr>
+          <w:rFonts w:ascii="Times New Roman" w:hAnsi="Times New Roman" w:eastAsia="宋体" w:cs="Times New Roman"/>
+          <w:b w:val="0"/>
+          <w:sz w:val="24"/>
+          <w:highlight w:val="yellow"/>
+        </w:rPr>
+        <w:t>【待补充：项目组成员与分工】</w:t>
+      </w:r>
+    </w:p>
+    <w:p>
+      <w:pPr>
+        <w:snapToGrid w:val="0"/>
+        <w:spacing w:lineRule="exact" w:line="440" w:before="0" w:after="0"/>
         <w:ind w:left="720" w:hanging="238"/>
         <w:jc w:val="both"/>
       </w:pPr>
@@ -1163,7 +1368,72 @@
     </w:p>
     <w:p>
       <w:pPr>
-        <w:spacing w:lineRule="exact" w:line="400" w:before="0" w:after="0"/>
+        <w:snapToGrid w:val="0"/>
+        <w:spacing w:lineRule="exact" w:line="440" w:before="0" w:after="0"/>
+        <w:ind w:left="720" w:hanging="238"/>
+        <w:jc w:val="both"/>
+      </w:pPr>
+      <w:r>
+        <w:rPr>
+          <w:rFonts w:ascii="Times New Roman" w:hAnsi="Times New Roman" w:eastAsia="宋体" w:cs="Times New Roman"/>
+          <w:sz w:val="24"/>
+        </w:rPr>
+        <w:t xml:space="preserve">• </w:t>
+      </w:r>
+      <w:r>
+        <w:rPr>
+          <w:rFonts w:ascii="Times New Roman" w:hAnsi="Times New Roman" w:eastAsia="宋体" w:cs="Times New Roman"/>
+          <w:b w:val="0"/>
+          <w:sz w:val="24"/>
+        </w:rPr>
+        <w:t>（三）2 工作条件：</w:t>
+      </w:r>
+      <w:r>
+        <w:rPr>
+          <w:rFonts w:ascii="Times New Roman" w:hAnsi="Times New Roman" w:eastAsia="宋体" w:cs="Times New Roman"/>
+          <w:b w:val="0"/>
+          <w:sz w:val="24"/>
+          <w:highlight w:val="yellow"/>
+        </w:rPr>
+        <w:t>【待补充：提供方与当前存放环境】</w:t>
+      </w:r>
+    </w:p>
+    <w:p>
+      <w:pPr>
+        <w:snapToGrid w:val="0"/>
+        <w:spacing w:lineRule="exact" w:line="440" w:before="0" w:after="0"/>
+        <w:ind w:left="720" w:hanging="238"/>
+        <w:jc w:val="both"/>
+      </w:pPr>
+      <w:r>
+        <w:rPr>
+          <w:rFonts w:ascii="Times New Roman" w:hAnsi="Times New Roman" w:eastAsia="宋体" w:cs="Times New Roman"/>
+          <w:sz w:val="24"/>
+        </w:rPr>
+        <w:t xml:space="preserve">• </w:t>
+      </w:r>
+      <w:r>
+        <w:rPr>
+          <w:rFonts w:ascii="Times New Roman" w:hAnsi="Times New Roman" w:eastAsia="宋体" w:cs="Times New Roman"/>
+          <w:b w:val="0"/>
+          <w:sz w:val="24"/>
+        </w:rPr>
+        <w:t>（三）2 工作条件：</w:t>
+      </w:r>
+      <w:r>
+        <w:rPr>
+          <w:rFonts w:ascii="Times New Roman" w:hAnsi="Times New Roman" w:eastAsia="宋体" w:cs="Times New Roman"/>
+          <w:b w:val="0"/>
+          <w:sz w:val="24"/>
+          <w:highlight w:val="yellow"/>
+        </w:rPr>
+        <w:t>【待补充：可提供的办公场所、境内计算与数据安全条件】</w:t>
+      </w:r>
+    </w:p>
+    <w:p>
+      <w:pPr>
+        <w:snapToGrid w:val="0"/>
+        <w:spacing w:lineRule="exact" w:line="440" w:before="0" w:after="0"/>
         <w:ind w:left="720" w:hanging="238"/>
         <w:jc w:val="both"/>
       </w:pPr>
@@ -1194,7 +1464,8 @@
     </w:p>
     <w:p>
       <w:pPr>
-        <w:spacing w:lineRule="exact" w:line="400" w:before="0" w:after="0"/>
+        <w:snapToGrid w:val="0"/>
+        <w:spacing w:lineRule="exact" w:line="440" w:before="0" w:after="0"/>
         <w:ind w:left="720" w:hanging="238"/>
         <w:jc w:val="both"/>
       </w:pPr>
@@ -1225,7 +1496,40 @@
     </w:p>
     <w:p>
       <w:pPr>
-        <w:spacing w:lineRule="exact" w:line="400" w:before="0" w:after="0"/>
+        <w:snapToGrid w:val="0"/>
+        <w:spacing w:lineRule="exact" w:line="440" w:before="0" w:after="0"/>
+        <w:ind w:left="720" w:hanging="238"/>
+        <w:jc w:val="both"/>
+      </w:pPr>
+      <w:r>
+        <w:rPr>
+          <w:rFonts w:ascii="Times New Roman" w:hAnsi="Times New Roman" w:eastAsia="宋体" w:cs="Times New Roman"/>
+          <w:sz w:val="24"/>
+        </w:rPr>
+        <w:t xml:space="preserve">• </w:t>
+      </w:r>
+      <w:r>
+        <w:rPr>
+          <w:rFonts w:ascii="Times New Roman" w:hAnsi="Times New Roman" w:eastAsia="宋体" w:cs="Times New Roman"/>
+          <w:b w:val="0"/>
+          <w:sz w:val="24"/>
+        </w:rPr>
+        <w:t>（三）2 工作条件：</w:t>
+      </w:r>
+      <w:r>
+        <w:rPr>
+          <w:rFonts w:ascii="Times New Roman" w:hAnsi="Times New Roman" w:eastAsia="宋体" w:cs="Times New Roman"/>
+          <w:b w:val="0"/>
+          <w:sz w:val="24"/>
+          <w:highlight w:val="yellow"/>
+        </w:rPr>
+        <w:t>【待补充：合作者姓名、单位与分工】</w:t>
+      </w:r>
+    </w:p>
+    <w:p>
+      <w:pPr>
+        <w:snapToGrid w:val="0"/>
+        <w:spacing w:lineRule="exact" w:line="440" w:before="0" w:after="0"/>
         <w:ind w:left="720" w:hanging="238"/>
         <w:jc w:val="both"/>
       </w:pPr>
@@ -1256,7 +1560,8 @@
     </w:p>
     <w:p>
       <w:pPr>
-        <w:spacing w:lineRule="exact" w:line="400" w:before="0" w:after="0"/>
+        <w:snapToGrid w:val="0"/>
+        <w:spacing w:lineRule="exact" w:line="440" w:before="0" w:after="0"/>
         <w:ind w:left="720" w:hanging="238"/>
         <w:jc w:val="both"/>
       </w:pPr>
@@ -1287,7 +1592,8 @@
     </w:p>
     <w:p>
       <w:pPr>
-        <w:spacing w:lineRule="exact" w:line="400" w:before="0" w:after="0"/>
+        <w:snapToGrid w:val="0"/>
+        <w:spacing w:lineRule="exact" w:line="440" w:before="0" w:after="0"/>
         <w:ind w:left="720" w:hanging="238"/>
         <w:jc w:val="both"/>
       </w:pPr>
@@ -1318,7 +1624,8 @@
     </w:p>
     <w:p>
       <w:pPr>
-        <w:spacing w:lineRule="exact" w:line="400" w:before="0" w:after="0"/>
+        <w:snapToGrid w:val="0"/>
+        <w:spacing w:lineRule="exact" w:line="440" w:before="0" w:after="0"/>
         <w:ind w:left="720" w:hanging="238"/>
         <w:jc w:val="both"/>
       </w:pPr>
@@ -1349,7 +1656,8 @@
     </w:p>
     <w:p>
       <w:pPr>
-        <w:spacing w:lineRule="exact" w:line="400" w:before="0" w:after="0"/>
+        <w:snapToGrid w:val="0"/>
+        <w:spacing w:lineRule="exact" w:line="440" w:before="0" w:after="0"/>
         <w:ind w:left="720" w:hanging="238"/>
         <w:jc w:val="both"/>
       </w:pPr>
@@ -1375,167 +1683,13 @@
           <w:sz w:val="24"/>
           <w:highlight w:val="yellow"/>
         </w:rPr>
-        <w:t>【待核实：是否为正式成员，否则本项写“无”】</w:t>
+        <w:t>【待核实：如为正式登记的项目组成员，请按模板字段逐项列出】</w:t>
       </w:r>
     </w:p>
     <w:p>
       <w:pPr>
-        <w:spacing w:lineRule="exact" w:line="400" w:before="0" w:after="0"/>
-        <w:ind w:left="720" w:hanging="238"/>
-        <w:jc w:val="both"/>
-      </w:pPr>
-      <w:r>
-        <w:rPr>
-          <w:rFonts w:ascii="Times New Roman" w:hAnsi="Times New Roman" w:eastAsia="宋体" w:cs="Times New Roman"/>
-          <w:sz w:val="24"/>
-        </w:rPr>
-        <w:t xml:space="preserve">• </w:t>
-      </w:r>
-      <w:r>
-        <w:rPr>
-          <w:rFonts w:ascii="Times New Roman" w:hAnsi="Times New Roman" w:eastAsia="宋体" w:cs="Times New Roman"/>
-          <w:b w:val="0"/>
-          <w:sz w:val="24"/>
-        </w:rPr>
-        <w:t>（三）3 正在承担的项目：</w:t>
-      </w:r>
-      <w:r>
-        <w:rPr>
-          <w:rFonts w:ascii="Times New Roman" w:hAnsi="Times New Roman" w:eastAsia="宋体" w:cs="Times New Roman"/>
-          <w:b w:val="0"/>
-          <w:sz w:val="24"/>
-          <w:highlight w:val="yellow"/>
-        </w:rPr>
-        <w:t>【待补充：项目名称】</w:t>
-      </w:r>
-    </w:p>
-    <w:p>
-      <w:pPr>
-        <w:spacing w:lineRule="exact" w:line="400" w:before="0" w:after="0"/>
-        <w:ind w:left="720" w:hanging="238"/>
-        <w:jc w:val="both"/>
-      </w:pPr>
-      <w:r>
-        <w:rPr>
-          <w:rFonts w:ascii="Times New Roman" w:hAnsi="Times New Roman" w:eastAsia="宋体" w:cs="Times New Roman"/>
-          <w:sz w:val="24"/>
-        </w:rPr>
-        <w:t xml:space="preserve">• </w:t>
-      </w:r>
-      <w:r>
-        <w:rPr>
-          <w:rFonts w:ascii="Times New Roman" w:hAnsi="Times New Roman" w:eastAsia="宋体" w:cs="Times New Roman"/>
-          <w:b w:val="0"/>
-          <w:sz w:val="24"/>
-        </w:rPr>
-        <w:t>（三）3 正在承担的项目：</w:t>
-      </w:r>
-      <w:r>
-        <w:rPr>
-          <w:rFonts w:ascii="Times New Roman" w:hAnsi="Times New Roman" w:eastAsia="宋体" w:cs="Times New Roman"/>
-          <w:b w:val="0"/>
-          <w:sz w:val="24"/>
-          <w:highlight w:val="yellow"/>
-        </w:rPr>
-        <w:t>【待补充：起止月份】</w:t>
-      </w:r>
-    </w:p>
-    <w:p>
-      <w:pPr>
-        <w:spacing w:lineRule="exact" w:line="400" w:before="0" w:after="0"/>
-        <w:ind w:left="720" w:hanging="238"/>
-        <w:jc w:val="both"/>
-      </w:pPr>
-      <w:r>
-        <w:rPr>
-          <w:rFonts w:ascii="Times New Roman" w:hAnsi="Times New Roman" w:eastAsia="宋体" w:cs="Times New Roman"/>
-          <w:sz w:val="24"/>
-        </w:rPr>
-        <w:t xml:space="preserve">• </w:t>
-      </w:r>
-      <w:r>
-        <w:rPr>
-          <w:rFonts w:ascii="Times New Roman" w:hAnsi="Times New Roman" w:eastAsia="宋体" w:cs="Times New Roman"/>
-          <w:b w:val="0"/>
-          <w:sz w:val="24"/>
-        </w:rPr>
-        <w:t>（三）3 正在承担的项目：</w:t>
-      </w:r>
-      <w:r>
-        <w:rPr>
-          <w:rFonts w:ascii="Times New Roman" w:hAnsi="Times New Roman" w:eastAsia="宋体" w:cs="Times New Roman"/>
-          <w:b w:val="0"/>
-          <w:sz w:val="24"/>
-          <w:highlight w:val="yellow"/>
-        </w:rPr>
-        <w:t>【待核实：提交时是否在研】</w:t>
-      </w:r>
-    </w:p>
-    <w:p>
-      <w:pPr>
-        <w:spacing w:lineRule="exact" w:line="400" w:before="0" w:after="0"/>
-        <w:ind w:left="720" w:hanging="238"/>
-        <w:jc w:val="both"/>
-      </w:pPr>
-      <w:r>
-        <w:rPr>
-          <w:rFonts w:ascii="Times New Roman" w:hAnsi="Times New Roman" w:eastAsia="宋体" w:cs="Times New Roman"/>
-          <w:sz w:val="24"/>
-        </w:rPr>
-        <w:t xml:space="preserve">• </w:t>
-      </w:r>
-      <w:r>
-        <w:rPr>
-          <w:rFonts w:ascii="Times New Roman" w:hAnsi="Times New Roman" w:eastAsia="宋体" w:cs="Times New Roman"/>
-          <w:b w:val="0"/>
-          <w:sz w:val="24"/>
-        </w:rPr>
-        <w:t>（三）3 正在承担的项目：</w:t>
-      </w:r>
-      <w:r>
-        <w:rPr>
-          <w:rFonts w:ascii="Times New Roman" w:hAnsi="Times New Roman" w:eastAsia="宋体" w:cs="Times New Roman"/>
-          <w:b w:val="0"/>
-          <w:sz w:val="24"/>
-          <w:highlight w:val="yellow"/>
-        </w:rPr>
-        <w:t>【待补充：在研者按上列字段列出】</w:t>
-      </w:r>
-    </w:p>
-    <w:p>
-      <w:pPr>
-        <w:spacing w:lineRule="exact" w:line="400" w:before="0" w:after="0"/>
-        <w:ind w:left="720" w:hanging="238"/>
-        <w:jc w:val="both"/>
-      </w:pPr>
-      <w:r>
-        <w:rPr>
-          <w:rFonts w:ascii="Times New Roman" w:hAnsi="Times New Roman" w:eastAsia="宋体" w:cs="Times New Roman"/>
-          <w:sz w:val="24"/>
-        </w:rPr>
-        <w:t xml:space="preserve">• </w:t>
-      </w:r>
-      <w:r>
-        <w:rPr>
-          <w:rFonts w:ascii="Times New Roman" w:hAnsi="Times New Roman" w:eastAsia="宋体" w:cs="Times New Roman"/>
-          <w:b w:val="0"/>
-          <w:sz w:val="24"/>
-        </w:rPr>
-        <w:t>（三）3 正在承担的项目：</w:t>
-      </w:r>
-      <w:r>
-        <w:rPr>
-          <w:rFonts w:ascii="Times New Roman" w:hAnsi="Times New Roman" w:eastAsia="宋体" w:cs="Times New Roman"/>
-          <w:b w:val="0"/>
-          <w:sz w:val="24"/>
-          <w:highlight w:val="yellow"/>
-        </w:rPr>
-        <w:t>【待核实：是否使用其数据】</w:t>
-      </w:r>
-    </w:p>
-    <w:p>
-      <w:pPr>
-        <w:spacing w:lineRule="exact" w:line="400" w:before="0" w:after="0"/>
+        <w:snapToGrid w:val="0"/>
+        <w:spacing w:lineRule="exact" w:line="440" w:before="0" w:after="0"/>
         <w:ind w:left="720" w:hanging="238"/>
         <w:jc w:val="both"/>
       </w:pPr>
@@ -1566,7 +1720,8 @@
     </w:p>
     <w:p>
       <w:pPr>
-        <w:spacing w:lineRule="exact" w:line="400" w:before="0" w:after="0"/>
+        <w:snapToGrid w:val="0"/>
+        <w:spacing w:lineRule="exact" w:line="440" w:before="0" w:after="0"/>
         <w:ind w:left="720" w:hanging="238"/>
         <w:jc w:val="both"/>
       </w:pPr>
@@ -1597,7 +1752,8 @@
     </w:p>
     <w:p>
       <w:pPr>
-        <w:spacing w:lineRule="exact" w:line="400" w:before="0" w:after="0"/>
+        <w:snapToGrid w:val="0"/>
+        <w:spacing w:lineRule="exact" w:line="440" w:before="0" w:after="0"/>
         <w:ind w:left="720" w:hanging="238"/>
         <w:jc w:val="both"/>
       </w:pPr>
@@ -1628,7 +1784,40 @@
     </w:p>
     <w:p>
       <w:pPr>
-        <w:spacing w:lineRule="exact" w:line="400" w:before="0" w:after="0"/>
+        <w:snapToGrid w:val="0"/>
+        <w:spacing w:lineRule="exact" w:line="440" w:before="0" w:after="0"/>
+        <w:ind w:left="720" w:hanging="238"/>
+        <w:jc w:val="both"/>
+      </w:pPr>
+      <w:r>
+        <w:rPr>
+          <w:rFonts w:ascii="Times New Roman" w:hAnsi="Times New Roman" w:eastAsia="宋体" w:cs="Times New Roman"/>
+          <w:sz w:val="24"/>
+        </w:rPr>
+        <w:t xml:space="preserve">• </w:t>
+      </w:r>
+      <w:r>
+        <w:rPr>
+          <w:rFonts w:ascii="Times New Roman" w:hAnsi="Times New Roman" w:eastAsia="宋体" w:cs="Times New Roman"/>
+          <w:b w:val="0"/>
+          <w:sz w:val="24"/>
+        </w:rPr>
+        <w:t>（四）5 其他：</w:t>
+      </w:r>
+      <w:r>
+        <w:rPr>
+          <w:rFonts w:ascii="Times New Roman" w:hAnsi="Times New Roman" w:eastAsia="宋体" w:cs="Times New Roman"/>
+          <w:b w:val="0"/>
+          <w:sz w:val="24"/>
+          <w:highlight w:val="yellow"/>
+        </w:rPr>
+        <w:t>【待核实：提交时间与状态】</w:t>
+      </w:r>
+    </w:p>
+    <w:p>
+      <w:pPr>
+        <w:snapToGrid w:val="0"/>
+        <w:spacing w:lineRule="exact" w:line="440" w:before="0" w:after="0"/>
         <w:ind w:left="720" w:hanging="238"/>
         <w:jc w:val="both"/>
       </w:pPr>
@@ -1659,7 +1848,8 @@
     </w:p>
     <w:p>
       <w:pPr>
-        <w:spacing w:lineRule="exact" w:line="400" w:before="0" w:after="0"/>
+        <w:snapToGrid w:val="0"/>
+        <w:spacing w:lineRule="exact" w:line="440" w:before="0" w:after="0"/>
         <w:ind w:left="720" w:hanging="238"/>
         <w:jc w:val="both"/>
       </w:pPr>
@@ -1690,7 +1880,8 @@
     </w:p>
     <w:p>
       <w:pPr>
-        <w:spacing w:lineRule="exact" w:line="400" w:before="0" w:after="0"/>
+        <w:snapToGrid w:val="0"/>
+        <w:spacing w:lineRule="exact" w:line="440" w:before="0" w:after="0"/>
         <w:ind w:left="720" w:hanging="238"/>
         <w:jc w:val="both"/>
       </w:pPr>
@@ -1722,6 +1913,7 @@
     <w:p>
       <w:pPr>
         <w:keepNext/>
+        <w:snapToGrid w:val="0"/>
         <w:spacing w:lineRule="exact" w:line="440" w:before="160" w:after="40"/>
         <w:jc w:val="both"/>
       </w:pPr>
@@ -1736,7 +1928,8 @@
     </w:p>
     <w:p>
       <w:pPr>
-        <w:spacing w:lineRule="exact" w:line="400" w:before="0" w:after="0"/>
+        <w:snapToGrid w:val="0"/>
+        <w:spacing w:lineRule="exact" w:line="440" w:before="0" w:after="0"/>
         <w:ind w:left="720" w:hanging="238"/>
         <w:jc w:val="both"/>
       </w:pPr>
@@ -1758,7 +1951,8 @@
     </w:p>
     <w:p>
       <w:pPr>
-        <w:spacing w:lineRule="exact" w:line="400" w:before="0" w:after="0"/>
+        <w:snapToGrid w:val="0"/>
+        <w:spacing w:lineRule="exact" w:line="440" w:before="0" w:after="0"/>
         <w:ind w:left="720" w:hanging="238"/>
         <w:jc w:val="both"/>
       </w:pPr>
@@ -1780,7 +1974,8 @@
     </w:p>
     <w:p>
       <w:pPr>
-        <w:spacing w:lineRule="exact" w:line="400" w:before="0" w:after="0"/>
+        <w:snapToGrid w:val="0"/>
+        <w:spacing w:lineRule="exact" w:line="440" w:before="0" w:after="0"/>
         <w:ind w:left="720" w:hanging="238"/>
         <w:jc w:val="both"/>
       </w:pPr>
@@ -1802,7 +1997,8 @@
     </w:p>
     <w:p>
       <w:pPr>
-        <w:spacing w:lineRule="exact" w:line="400" w:before="0" w:after="0"/>
+        <w:snapToGrid w:val="0"/>
+        <w:spacing w:lineRule="exact" w:line="440" w:before="0" w:after="0"/>
         <w:ind w:left="720" w:hanging="238"/>
         <w:jc w:val="both"/>
       </w:pPr>
@@ -1824,7 +2020,8 @@
     </w:p>
     <w:p>
       <w:pPr>
-        <w:spacing w:lineRule="exact" w:line="400" w:before="0" w:after="0"/>
+        <w:snapToGrid w:val="0"/>
+        <w:spacing w:lineRule="exact" w:line="440" w:before="0" w:after="0"/>
         <w:ind w:left="720" w:hanging="238"/>
         <w:jc w:val="both"/>
       </w:pPr>
@@ -1846,7 +2043,8 @@
     </w:p>
     <w:p>
       <w:pPr>
-        <w:spacing w:lineRule="exact" w:line="400" w:before="0" w:after="0"/>
+        <w:snapToGrid w:val="0"/>
+        <w:spacing w:lineRule="exact" w:line="440" w:before="0" w:after="0"/>
         <w:ind w:left="720" w:hanging="238"/>
         <w:jc w:val="both"/>
       </w:pPr>
@@ -1868,7 +2066,8 @@
     </w:p>
     <w:p>
       <w:pPr>
-        <w:spacing w:lineRule="exact" w:line="400" w:before="0" w:after="0"/>
+        <w:snapToGrid w:val="0"/>
+        <w:spacing w:lineRule="exact" w:line="440" w:before="0" w:after="0"/>
         <w:ind w:left="720" w:hanging="238"/>
         <w:jc w:val="both"/>
       </w:pPr>
@@ -1890,7 +2089,8 @@
     </w:p>
     <w:p>
       <w:pPr>
-        <w:spacing w:lineRule="exact" w:line="400" w:before="0" w:after="0"/>
+        <w:snapToGrid w:val="0"/>
+        <w:spacing w:lineRule="exact" w:line="440" w:before="0" w:after="0"/>
         <w:ind w:left="720" w:hanging="238"/>
         <w:jc w:val="both"/>
       </w:pPr>
@@ -1913,6 +2113,7 @@
     <w:p>
       <w:pPr>
         <w:keepNext/>
+        <w:snapToGrid w:val="0"/>
         <w:spacing w:lineRule="exact" w:line="440" w:before="160" w:after="40"/>
         <w:jc w:val="both"/>
       </w:pPr>
@@ -1927,7 +2128,8 @@
     </w:p>
     <w:p>
       <w:pPr>
-        <w:spacing w:lineRule="exact" w:line="400" w:before="0" w:after="0"/>
+        <w:snapToGrid w:val="0"/>
+        <w:spacing w:lineRule="exact" w:line="440" w:before="0" w:after="0"/>
         <w:ind w:firstLineChars="200" w:firstLine="480"/>
         <w:jc w:val="both"/>
       </w:pPr>

</xml_diff>